<commit_message>
Repaso de congruencia entre BRD, FRD, Test Plan y Test Cases
- Release en noviembre de 2026 en los cuatro documentos (R-01 y minuta 3).
- Regla 17 en el BRD y el FRD: el usuario de la sesion no puede
  cambiarse el rol ni darse de baja (caso 15 del Test Plan).
- Un usuario puede no tener rol (AR-11, CA-11 y glosario), como en la
  API y en TEST-013.
- FRD: DIA 2 y DIA 4 cuentan los articulos sin stock y sin umbral, como
  la captura de SC001. BRD: el Dia 4 repone dos articulos con poco stock.
- Glosario: el umbral minimo incluye el stock igual al umbral (regla C2).
- Test Plan: Pruebas Masivas describe los datos de ejemplo, el caso 13
  usa un usuario sin rol, y se corrigen palabras faltantes y tildes.
- Mismo subtitulo en los cuatro documentos e indices actualizados.
- Dashboard: se recalcula con cada venta, entrada de stock o
  modificacion de un articulo (los ajustes quedaron fuera del alcance).
</commit_message>
<xml_diff>
--- a/BRD v1.5.docx
+++ b/BRD v1.5.docx
@@ -331,7 +331,7 @@
         </w:rPr>
         <w:t xml:space="preserve">Release: </w:t>
         <w:tab/>
-        <w:t>Diciembre 2026</w:t>
+        <w:t>Noviembre 2026</w:t>
       </w:r>
     </w:p>
     <w:p>
@@ -562,7 +562,7 @@
               </w:rPr>
               <w:t>2.4. Restricciones</w:t>
               <w:tab/>
-              <w:t>4</w:t>
+              <w:t>5</w:t>
             </w:r>
           </w:hyperlink>
         </w:p>
@@ -856,7 +856,7 @@
               </w:rPr>
               <w:t>7.3. Reunión 3 – 08/09/2026</w:t>
               <w:tab/>
-              <w:t>12</w:t>
+              <w:t>13</w:t>
             </w:r>
           </w:hyperlink>
           <w:r>
@@ -2840,7 +2840,7 @@
                 <w:shd w:fill="auto" w:val="clear"/>
                 <w:vertAlign w:val="baseline"/>
               </w:rPr>
-              <w:t>Se reincorporan los perfiles de usuario como roles con permisos por pantalla, igual que en el FRD v1.2: alcance, dependencias, regla 16, caso de estudio 9, historia de usuario AR-11 y glosario (permiso, rol y usuario). Se agrega la pantalla SC005 de administración de usuarios, que se abre desde el menú del usuario. La regla 1 y el criterio de aceptación de AR-6 incluyen los artículos sin stock aunque no tengan umbral. Los ajustes de inventario pasan a estar fuera del alcance y la pantalla SC001 ya no incluye movimientos recientes ni accesos directos. La regla 4 descarta la venta sin registrar al cerrar sesión, sin pedir confirmación. El glosario aclara que se ingresa con el nombre del usuario y que cada movimiento guarda el usuario que lo hizo.</w:t>
+              <w:t>Se reincorporan los perfiles de usuario como roles con permisos por pantalla, igual que en el FRD v1.2: alcance, dependencias, regla 16, caso de estudio 9, historia de usuario AR-11 y glosario (permiso, rol y usuario). Se agrega la pantalla SC005 de administración de usuarios, que se abre desde el menú del usuario. La regla 1 y el criterio de aceptación de AR-6 incluyen los artículos sin stock aunque no tengan umbral. Los ajustes de inventario pasan a estar fuera del alcance y la pantalla SC001 ya no incluye movimientos recientes ni accesos directos. La regla 4 descarta la venta sin registrar al cerrar sesión, sin pedir confirmación. El glosario aclara que se ingresa con el nombre del usuario y que cada movimiento guarda el usuario que lo hizo. Se agrega la regla 17: el usuario de la sesión no puede cambiarse el rol ni darse de baja. Un usuario puede no tener rol, y entonces no accede a ninguna pantalla. El release pasa a noviembre de 2026 (R-01).</w:t>
             </w:r>
           </w:p>
         </w:tc>
@@ -3614,7 +3614,7 @@
                 <w:shd w:fill="auto" w:val="clear"/>
                 <w:vertAlign w:val="baseline"/>
               </w:rPr>
-              <w:t>El sistema debe encontrarse operativo en diciembre de 2026, fecha de cierre del cuatrimestre.</w:t>
+              <w:t>El sistema debe encontrarse operativo en noviembre de 2026, fecha de cierre del cuatrimestre.</w:t>
             </w:r>
           </w:p>
         </w:tc>
@@ -6675,6 +6675,125 @@
           </w:p>
         </w:tc>
       </w:tr>
+      <w:tr>
+        <w:trPr/>
+        <w:tc>
+          <w:tcPr>
+            <w:tcW w:w="1091" w:type="dxa"/>
+            <w:tcBorders/>
+            <w:vAlign w:val="center"/>
+          </w:tcPr>
+          <w:p>
+            <w:pPr>
+              <w:pStyle w:val="normal1"/>
+              <w:keepNext w:val="false"/>
+              <w:keepLines w:val="false"/>
+              <w:widowControl w:val="false"/>
+              <w:shd w:val="clear" w:fill="auto"/>
+              <w:spacing w:lineRule="auto" w:line="240" w:before="0" w:after="0"/>
+              <w:ind w:hanging="0" w:left="0" w:right="0"/>
+              <w:jc w:val="left"/>
+              <w:rPr>
+                <w:rFonts w:ascii="Calibri" w:hAnsi="Calibri" w:eastAsia="Calibri" w:cs="Calibri"/>
+                <w:b w:val="false"/>
+                <w:bCs w:val="false"/>
+                <w:i w:val="false"/>
+                <w:iCs w:val="false"/>
+                <w:caps w:val="false"/>
+                <w:smallCaps w:val="false"/>
+                <w:strike w:val="false"/>
+                <w:dstrike w:val="false"/>
+                <w:color w:val="000000"/>
+                <w:position w:val="0"/>
+                <w:sz w:val="20"/>
+                <w:szCs w:val="20"/>
+                <w:u w:val="none"/>
+                <w:shd w:fill="auto" w:val="clear"/>
+                <w:vertAlign w:val="baseline"/>
+              </w:rPr>
+            </w:pPr>
+            <w:r>
+              <w:rPr>
+                <w:rFonts w:eastAsia="Calibri" w:cs="Calibri"/>
+                <w:b w:val="false"/>
+                <w:bCs w:val="false"/>
+                <w:i w:val="false"/>
+                <w:iCs w:val="false"/>
+                <w:caps w:val="false"/>
+                <w:smallCaps w:val="false"/>
+                <w:strike w:val="false"/>
+                <w:dstrike w:val="false"/>
+                <w:color w:val="000000"/>
+                <w:position w:val="0"/>
+                <w:sz w:val="20"/>
+                <w:szCs w:val="20"/>
+                <w:u w:val="none"/>
+                <w:shd w:fill="auto" w:val="clear"/>
+                <w:vertAlign w:val="baseline"/>
+              </w:rPr>
+              <w:t>Regla 17</w:t>
+            </w:r>
+          </w:p>
+        </w:tc>
+        <w:tc>
+          <w:tcPr>
+            <w:tcW w:w="8989" w:type="dxa"/>
+            <w:tcBorders/>
+            <w:vAlign w:val="center"/>
+          </w:tcPr>
+          <w:p>
+            <w:pPr>
+              <w:pStyle w:val="normal1"/>
+              <w:keepNext w:val="false"/>
+              <w:keepLines w:val="false"/>
+              <w:widowControl w:val="false"/>
+              <w:shd w:val="clear" w:fill="auto"/>
+              <w:spacing w:lineRule="auto" w:line="240" w:before="0" w:after="0"/>
+              <w:ind w:hanging="0" w:left="0" w:right="0"/>
+              <w:jc w:val="left"/>
+              <w:rPr>
+                <w:rFonts w:ascii="Calibri" w:hAnsi="Calibri" w:eastAsia="Calibri" w:cs="Calibri"/>
+                <w:b w:val="false"/>
+                <w:bCs w:val="false"/>
+                <w:i w:val="false"/>
+                <w:iCs w:val="false"/>
+                <w:caps w:val="false"/>
+                <w:smallCaps w:val="false"/>
+                <w:strike w:val="false"/>
+                <w:dstrike w:val="false"/>
+                <w:color w:val="000000"/>
+                <w:position w:val="0"/>
+                <w:sz w:val="20"/>
+                <w:szCs w:val="20"/>
+                <w:u w:val="none"/>
+                <w:shd w:fill="auto" w:val="clear"/>
+                <w:vertAlign w:val="baseline"/>
+              </w:rPr>
+            </w:pPr>
+            <w:r>
+              <w:rPr>
+                <w:rFonts w:eastAsia="Calibri" w:cs="Calibri"/>
+                <w:b w:val="false"/>
+                <w:bCs w:val="false"/>
+                <w:i w:val="false"/>
+                <w:iCs w:val="false"/>
+                <w:caps w:val="false"/>
+                <w:smallCaps w:val="false"/>
+                <w:strike w:val="false"/>
+                <w:dstrike w:val="false"/>
+                <w:color w:val="000000"/>
+                <w:position w:val="0"/>
+                <w:sz w:val="20"/>
+                <w:szCs w:val="20"/>
+                <w:u w:val="none"/>
+                <w:shd w:fill="auto" w:val="clear"/>
+                <w:vertAlign w:val="baseline"/>
+              </w:rPr>
+              <w:t>Si el usuario que inició sesión intenta cambiarse el rol o darse de baja, rechazar la operación.</w:t>
+            </w:r>
+          </w:p>
+        </w:tc>
+      </w:tr>
     </w:tbl>
     <w:p>
       <w:pPr>
@@ -6717,7 +6836,7 @@
     <w:p>
       <w:pPr>
         <w:pStyle w:val="normal1"/>
-        <w:keepNext w:val="false"/>
+        <w:keepNext w:val="true"/>
         <w:keepLines w:val="false"/>
         <w:widowControl/>
         <w:shd w:val="clear" w:fill="auto"/>
@@ -6736,7 +6855,7 @@
           <w:sz w:val="24"/>
           <w:szCs w:val="24"/>
         </w:rPr>
-        <w:t>Dia 1:</w:t>
+        <w:t>Día 1:</w:t>
       </w:r>
     </w:p>
     <w:p>
@@ -6771,13 +6890,13 @@
           <w:sz w:val="24"/>
           <w:szCs w:val="24"/>
         </w:rPr>
-        <w:t xml:space="preserve"> Se agrego un articulo sin precio asignado.</w:t>
+        <w:t xml:space="preserve"> Se agregó un artículo sin precio asignado.</w:t>
       </w:r>
     </w:p>
     <w:p>
       <w:pPr>
         <w:pStyle w:val="normal1"/>
-        <w:keepNext w:val="false"/>
+        <w:keepNext w:val="true"/>
         <w:keepLines w:val="false"/>
         <w:widowControl/>
         <w:shd w:val="clear" w:fill="auto"/>
@@ -6796,7 +6915,7 @@
           <w:sz w:val="24"/>
           <w:szCs w:val="24"/>
         </w:rPr>
-        <w:t>Dia 2:</w:t>
+        <w:t>Día 2:</w:t>
       </w:r>
     </w:p>
     <w:p>
@@ -6831,13 +6950,13 @@
           <w:sz w:val="24"/>
           <w:szCs w:val="24"/>
         </w:rPr>
-        <w:t xml:space="preserve"> Se abrio el programa y hay articulos con poco stock.</w:t>
+        <w:t xml:space="preserve"> Se abrió el programa y hay artículos con poco stock.</w:t>
       </w:r>
     </w:p>
     <w:p>
       <w:pPr>
         <w:pStyle w:val="normal1"/>
-        <w:keepNext w:val="false"/>
+        <w:keepNext w:val="true"/>
         <w:keepLines w:val="false"/>
         <w:widowControl/>
         <w:shd w:val="clear" w:fill="auto"/>
@@ -6856,7 +6975,7 @@
           <w:sz w:val="24"/>
           <w:szCs w:val="24"/>
         </w:rPr>
-        <w:t>Dia 3:</w:t>
+        <w:t>Día 3:</w:t>
       </w:r>
     </w:p>
     <w:p>
@@ -6891,13 +7010,13 @@
           <w:sz w:val="24"/>
           <w:szCs w:val="24"/>
         </w:rPr>
-        <w:t xml:space="preserve"> Se intenta vender cinco unidades de un articulo del que solo hay dos en existencia.</w:t>
+        <w:t xml:space="preserve"> Se intenta vender cinco unidades de un artículo del que solo hay dos en existencia.</w:t>
       </w:r>
     </w:p>
     <w:p>
       <w:pPr>
         <w:pStyle w:val="normal1"/>
-        <w:keepNext w:val="false"/>
+        <w:keepNext w:val="true"/>
         <w:keepLines w:val="false"/>
         <w:widowControl/>
         <w:shd w:val="clear" w:fill="auto"/>
@@ -6916,7 +7035,7 @@
           <w:sz w:val="24"/>
           <w:szCs w:val="24"/>
         </w:rPr>
-        <w:t>Dia 4:</w:t>
+        <w:t>Día 4:</w:t>
       </w:r>
     </w:p>
     <w:p>
@@ -6951,13 +7070,13 @@
           <w:sz w:val="24"/>
           <w:szCs w:val="24"/>
         </w:rPr>
-        <w:t xml:space="preserve"> Se registran las entradas de mercadería de una factura de compra que repone tres articulos con poco stock.</w:t>
+        <w:t xml:space="preserve"> Se registran las entradas de mercadería de una factura de compra de tres artículos, dos de ellos con poco stock.</w:t>
       </w:r>
     </w:p>
     <w:p>
       <w:pPr>
         <w:pStyle w:val="normal1"/>
-        <w:keepNext w:val="false"/>
+        <w:keepNext w:val="true"/>
         <w:keepLines w:val="false"/>
         <w:widowControl/>
         <w:shd w:val="clear" w:fill="auto"/>
@@ -6976,7 +7095,7 @@
           <w:sz w:val="24"/>
           <w:szCs w:val="24"/>
         </w:rPr>
-        <w:t>Dia 5:</w:t>
+        <w:t>Día 5:</w:t>
       </w:r>
     </w:p>
     <w:p>
@@ -7011,13 +7130,13 @@
           <w:sz w:val="24"/>
           <w:szCs w:val="24"/>
         </w:rPr>
-        <w:t xml:space="preserve"> Se intenta cargar un articulo que ya existe con el mismo codigo del mismo proveedor.</w:t>
+        <w:t xml:space="preserve"> Se intenta cargar un artículo que ya existe, con el mismo código y del mismo proveedor.</w:t>
       </w:r>
     </w:p>
     <w:p>
       <w:pPr>
         <w:pStyle w:val="normal1"/>
-        <w:keepNext w:val="false"/>
+        <w:keepNext w:val="true"/>
         <w:keepLines w:val="false"/>
         <w:widowControl/>
         <w:shd w:val="clear" w:fill="auto"/>
@@ -7036,7 +7155,7 @@
           <w:sz w:val="24"/>
           <w:szCs w:val="24"/>
         </w:rPr>
-        <w:t>Dia 6:</w:t>
+        <w:t>Día 6:</w:t>
       </w:r>
     </w:p>
     <w:p>
@@ -7077,7 +7196,7 @@
     <w:p>
       <w:pPr>
         <w:pStyle w:val="normal1"/>
-        <w:keepNext w:val="false"/>
+        <w:keepNext w:val="true"/>
         <w:keepLines w:val="false"/>
         <w:widowControl/>
         <w:shd w:val="clear" w:fill="auto"/>
@@ -7096,7 +7215,7 @@
           <w:sz w:val="24"/>
           <w:szCs w:val="24"/>
         </w:rPr>
-        <w:t>Dia 7:</w:t>
+        <w:t>Día 7:</w:t>
       </w:r>
     </w:p>
     <w:p>
@@ -7137,7 +7256,7 @@
     <w:p>
       <w:pPr>
         <w:pStyle w:val="normal1"/>
-        <w:keepNext w:val="false"/>
+        <w:keepNext w:val="true"/>
         <w:keepLines w:val="false"/>
         <w:widowControl/>
         <w:shd w:val="clear" w:fill="auto"/>
@@ -7156,7 +7275,7 @@
           <w:sz w:val="24"/>
           <w:szCs w:val="24"/>
         </w:rPr>
-        <w:t>Dia 8:</w:t>
+        <w:t>Día 8:</w:t>
       </w:r>
     </w:p>
     <w:p>
@@ -7197,7 +7316,7 @@
     <w:p>
       <w:pPr>
         <w:pStyle w:val="normal1"/>
-        <w:keepNext w:val="false"/>
+        <w:keepNext w:val="true"/>
         <w:keepLines w:val="false"/>
         <w:widowControl/>
         <w:shd w:val="clear" w:fill="auto"/>
@@ -7216,7 +7335,7 @@
           <w:sz w:val="24"/>
           <w:szCs w:val="24"/>
         </w:rPr>
-        <w:t>Dia 9:</w:t>
+        <w:t>Día 9:</w:t>
       </w:r>
     </w:p>
     <w:p>
@@ -8619,7 +8738,7 @@
           <w:sz w:val="24"/>
           <w:szCs w:val="24"/>
         </w:rPr>
-        <w:t xml:space="preserve"> Cada usuario tiene un rol, y cada rol tiene un permiso por cada pantalla que habilita. La barra lateral y el menú del usuario muestran solo esas pantallas, y una pantalla sin permiso no se abre aunque se escriba su dirección.</w:t>
+        <w:t xml:space="preserve"> Cada usuario tiene a lo sumo un rol, y cada rol tiene un permiso por cada pantalla que habilita. La barra lateral y el menú del usuario muestran solo esas pantallas, y una pantalla sin permiso no se abre aunque se escriba su dirección.</w:t>
       </w:r>
     </w:p>
     <w:p>
@@ -8937,7 +9056,7 @@
           <w:sz w:val="24"/>
           <w:szCs w:val="24"/>
         </w:rPr>
-        <w:t xml:space="preserve"> Calcular y generar las sugerencias basadas en los artículos registrados, priorizando los elementos de menor stock o stock nulo.</w:t>
+        <w:t xml:space="preserve"> Calcular y generar las sugerencias basadas en los artículos registrados, priorizando los artículos sin stock y, después, los de menor stock en relación con su umbral mínimo.</w:t>
       </w:r>
     </w:p>
     <w:p>
@@ -9143,7 +9262,7 @@
           <w:sz w:val="24"/>
           <w:szCs w:val="24"/>
         </w:rPr>
-        <w:t xml:space="preserve"> registro de las operaciones que modifican el stock (altas, bajas, modificaciones, ventas y entradas), con buscador por fecha o identificador y carga de entradas de stock con referencia opcional a la factura o remito.</w:t>
+        <w:t xml:space="preserve"> registro de las operaciones sobre el inventario (altas, bajas y modificaciones de artículos y proveedores, ventas y entradas), con buscador por fecha o identificador y carga de entradas de stock con referencia opcional a la factura o remito.</w:t>
       </w:r>
     </w:p>
     <w:p>
@@ -9178,7 +9297,7 @@
           <w:sz w:val="24"/>
           <w:szCs w:val="24"/>
         </w:rPr>
-        <w:t xml:space="preserve"> alta, baja y modificación de los usuarios y de su rol. Se abre desde el menú del usuario, en el encabezado, y solo con el permiso Usuarios.</w:t>
+        <w:t xml:space="preserve"> alta, baja y modificación de los usuarios y de su rol. Se abre desde el menú del usuario, en el encabezado, y solo con el permiso Usuarios. El usuario de la sesión no puede cambiarse el rol ni darse de baja (regla 17).</w:t>
       </w:r>
     </w:p>
     <w:p>
@@ -10903,7 +11022,7 @@
                 <w:shd w:fill="auto" w:val="clear"/>
                 <w:vertAlign w:val="baseline"/>
               </w:rPr>
-              <w:t>Perfil de un usuario: el conjunto de permisos que define qué pantallas puede usar. Cada usuario tiene un rol; el rol admin tiene todos los permisos y el rol empleado, solo Dashboard y Ventas.</w:t>
+              <w:t>Perfil de un usuario: el conjunto de permisos que define qué pantallas puede usar. Cada usuario tiene a lo sumo un rol, y sin rol no puede usar ninguna pantalla. El rol admin tiene todos los permisos y el rol empleado, solo Dashboard y Ventas.</w:t>
             </w:r>
           </w:p>
         </w:tc>
@@ -11379,7 +11498,7 @@
                 <w:shd w:fill="auto" w:val="clear"/>
                 <w:vertAlign w:val="baseline"/>
               </w:rPr>
-              <w:t>Cantidad de unidades por debajo de la cual el sistema considera que un artículo debe reponerse y emite el aviso correspondiente.</w:t>
+              <w:t>Cantidad mínima de unidades de un artículo: si su stock es igual o menor, el sistema considera que debe reponerse y emite el aviso correspondiente.</w:t>
             </w:r>
           </w:p>
         </w:tc>
@@ -11617,7 +11736,7 @@
                 <w:shd w:fill="auto" w:val="clear"/>
                 <w:vertAlign w:val="baseline"/>
               </w:rPr>
-              <w:t>Cuenta con la que un empleado ingresa al sistema. Tiene nombre, apellido, teléfono, contraseña y rol; se ingresa con el nombre y la contraseña.</w:t>
+              <w:t>Cuenta con la que un empleado ingresa al sistema. Tiene nombre, apellido, teléfono, contraseña y, de forma opcional, un rol; se ingresa con el nombre y la contraseña.</w:t>
             </w:r>
           </w:p>
         </w:tc>
@@ -12276,7 +12395,7 @@
           <w:sz w:val="24"/>
           <w:szCs w:val="24"/>
         </w:rPr>
-        <w:t xml:space="preserve"> Se congela el alcance del release de diciembre de 2026. Facturación electrónica y venta en línea quedan fuera del alcance.</w:t>
+        <w:t xml:space="preserve"> Se congela el alcance del release de noviembre de 2026. Facturación electrónica y venta en línea quedan fuera del alcance.</w:t>
       </w:r>
     </w:p>
     <w:p>

</xml_diff>